<commit_message>
Completed Sonar Analyst, Manager, Deris Removal Operator
</commit_message>
<xml_diff>
--- a/Q&A.docx
+++ b/Q&A.docx
@@ -4,285 +4,153 @@
   <w:body>
     <w:p>
       <w:pPr>
-        <w:ind w:left="720" w:hanging="360"/>
-      </w:pPr>
-      <w:r>
-        <w:t>Why this software we should if already it is done by humans?</w:t>
-      </w:r>
-    </w:p>
-    <w:p>
-      <w:pPr>
-        <w:ind w:left="720" w:hanging="360"/>
-      </w:pPr>
-      <w:r>
-        <w:rPr>
-          <w:b/>
-          <w:bCs/>
-        </w:rPr>
-        <w:t>Saves Time &amp; Labor</w:t>
-      </w:r>
-      <w:r>
-        <w:t>: Manual sonar checking costs </w:t>
-      </w:r>
-      <w:r>
-        <w:rPr>
-          <w:b/>
-          <w:bCs/>
-        </w:rPr>
-        <w:t>₹1 Lakh per day</w:t>
-      </w:r>
-      <w:r>
-        <w:t>. Our AI detects debris automatically in </w:t>
-      </w:r>
-      <w:r>
-        <w:rPr>
-          <w:b/>
-          <w:bCs/>
-        </w:rPr>
-        <w:t>seconds</w:t>
-      </w:r>
-    </w:p>
-    <w:p>
-      <w:pPr>
-        <w:ind w:left="360"/>
-      </w:pPr>
-      <w:r>
-        <w:rPr>
-          <w:b/>
-          <w:bCs/>
-        </w:rPr>
-        <w:t>Saves Fuel Money</w:t>
-      </w:r>
-      <w:r>
-        <w:t>: Our route planner cuts travel distance by </w:t>
-      </w:r>
-      <w:r>
-        <w:rPr>
-          <w:b/>
-          <w:bCs/>
-        </w:rPr>
-        <w:t>35%</w:t>
-      </w:r>
-      <w:r>
-        <w:t>, saving thousands of liters of diesel on every trip..</w:t>
-      </w:r>
-    </w:p>
-    <w:p>
-      <w:pPr>
-        <w:ind w:left="360"/>
-      </w:pPr>
-      <w:r>
-        <w:rPr>
-          <w:b/>
-          <w:bCs/>
-        </w:rPr>
-        <w:t>Fast Return on Investment</w:t>
-      </w:r>
-      <w:r>
-        <w:t>: The customer saves more money in </w:t>
-      </w:r>
-      <w:r>
-        <w:rPr>
-          <w:b/>
-          <w:bCs/>
-        </w:rPr>
-        <w:t>3 trips</w:t>
-      </w:r>
-      <w:r>
-        <w:t> than what they pay us for the whole year.</w:t>
-      </w:r>
-    </w:p>
-    <w:p>
-      <w:pPr>
-        <w:ind w:left="360"/>
-      </w:pPr>
-    </w:p>
-    <w:p>
-      <w:pPr>
-        <w:ind w:left="360"/>
-      </w:pPr>
-      <w:r>
-        <w:t>What will be the price of this product(if asked)?</w:t>
-      </w:r>
-    </w:p>
-    <w:p>
-      <w:pPr>
-        <w:ind w:left="360"/>
-      </w:pPr>
-      <w:r>
-        <w:t>3.5 lakh per ship. It includes all AI detection, 3D map, Optimal Routing for debris cleaning.</w:t>
-      </w:r>
-    </w:p>
-    <w:p>
-      <w:pPr>
-        <w:ind w:left="720" w:hanging="360"/>
-      </w:pPr>
-    </w:p>
-    <w:p>
-      <w:pPr>
-        <w:pStyle w:val="ListParagraph"/>
-        <w:numPr>
-          <w:ilvl w:val="0"/>
-          <w:numId w:val="9"/>
-        </w:numPr>
-        <w:rPr>
-          <w:b/>
-          <w:bCs/>
-        </w:rPr>
-      </w:pPr>
-      <w:r>
-        <w:rPr>
-          <w:b/>
-          <w:bCs/>
-        </w:rPr>
-        <w:t>Project Overview &amp; Problem Statement</w:t>
-      </w:r>
-    </w:p>
-    <w:p>
-      <w:pPr>
-        <w:pStyle w:val="ListParagraph"/>
-        <w:rPr>
-          <w:b/>
-          <w:bCs/>
-        </w:rPr>
-      </w:pPr>
-    </w:p>
-    <w:p>
-      <w:pPr>
-        <w:numPr>
-          <w:ilvl w:val="0"/>
-          <w:numId w:val="1"/>
-        </w:numPr>
-      </w:pPr>
-      <w:r>
-        <w:rPr>
-          <w:b/>
-          <w:bCs/>
-        </w:rPr>
-        <w:t>Q1: What is the core objective of your project?</w:t>
-      </w:r>
-    </w:p>
-    <w:p>
-      <w:pPr>
-        <w:numPr>
-          <w:ilvl w:val="1"/>
-          <w:numId w:val="1"/>
-        </w:numPr>
-      </w:pPr>
-      <w:r>
-        <w:rPr>
-          <w:b/>
-          <w:bCs/>
-        </w:rPr>
-        <w:t>A:</w:t>
-      </w:r>
-      <w:r>
-        <w:t> To automate underwater marine debris detection from sonar imagery, calculate accurate GPS coordinates, and generate optimal cleanup trajectories for marine vessels.</w:t>
-      </w:r>
-    </w:p>
-    <w:p>
-      <w:pPr>
-        <w:numPr>
-          <w:ilvl w:val="0"/>
-          <w:numId w:val="1"/>
-        </w:numPr>
-      </w:pPr>
-      <w:r>
-        <w:rPr>
-          <w:b/>
-          <w:bCs/>
-        </w:rPr>
-        <w:t>Q2: What real-world problem does this system solve?</w:t>
-      </w:r>
-    </w:p>
-    <w:p>
-      <w:pPr>
-        <w:numPr>
-          <w:ilvl w:val="1"/>
-          <w:numId w:val="1"/>
-        </w:numPr>
-      </w:pPr>
-      <w:r>
-        <w:rPr>
-          <w:b/>
-          <w:bCs/>
-        </w:rPr>
-        <w:t>A:</w:t>
-      </w:r>
-      <w:r>
-        <w:t> It eliminates manual sonar image inspection, resolves GPS location ambiguity for submerged debris, and reduces fuel and operational time for marine cleanup missions.</w:t>
-      </w:r>
-    </w:p>
-    <w:p>
-      <w:pPr>
-        <w:numPr>
-          <w:ilvl w:val="0"/>
-          <w:numId w:val="1"/>
-        </w:numPr>
-      </w:pPr>
-      <w:r>
-        <w:rPr>
-          <w:b/>
-          <w:bCs/>
-        </w:rPr>
-        <w:t>Q3: Who are the target end-users of this application?</w:t>
-      </w:r>
-    </w:p>
-    <w:p>
-      <w:pPr>
-        <w:numPr>
-          <w:ilvl w:val="1"/>
-          <w:numId w:val="1"/>
-        </w:numPr>
-      </w:pPr>
-      <w:r>
-        <w:rPr>
-          <w:b/>
-          <w:bCs/>
-        </w:rPr>
-        <w:t>A:</w:t>
-      </w:r>
-      <w:r>
-        <w:t> Coast Guard agencies, marine conservation organizations, port authorities, and autonomous underwater vehicle (AUV/ROV) operators.</w:t>
-      </w:r>
-    </w:p>
-    <w:p>
-      <w:pPr>
-        <w:numPr>
-          <w:ilvl w:val="0"/>
-          <w:numId w:val="1"/>
-        </w:numPr>
-      </w:pPr>
-      <w:r>
-        <w:rPr>
-          <w:b/>
-          <w:bCs/>
-        </w:rPr>
-        <w:t>Q4: What are the key modules integrated into your solution?</w:t>
-      </w:r>
-    </w:p>
-    <w:p>
-      <w:pPr>
-        <w:numPr>
-          <w:ilvl w:val="1"/>
-          <w:numId w:val="1"/>
-        </w:numPr>
-      </w:pPr>
-      <w:r>
-        <w:rPr>
-          <w:b/>
-          <w:bCs/>
-        </w:rPr>
-        <w:t>A:</w:t>
-      </w:r>
-      <w:r>
-        <w:t> Adaptive Image Denoising, YOLO Object Detection, Vincenty Geodesic Coordinates Calculation, 2D/3D Map Visualizations, and Greedy+2-Opt Trajectory Optimization.</w:t>
-      </w:r>
-    </w:p>
-    <w:p>
-      <w:r>
-        <w:pict w14:anchorId="33052DF6">
-          <v:rect id="_x0000_i1067" style="width:564pt;height:.75pt" o:hrpct="0" o:hralign="center" o:hrstd="t" o:hr="t" fillcolor="#a0a0a0" stroked="f"/>
+        <w:rPr>
+          <w:b/>
+          <w:bCs/>
+        </w:rPr>
+      </w:pPr>
+      <w:r>
+        <w:rPr>
+          <w:b/>
+          <w:bCs/>
+        </w:rPr>
+        <w:t>Problem Understanding</w:t>
+      </w:r>
+    </w:p>
+    <w:p>
+      <w:r>
+        <w:rPr>
+          <w:b/>
+          <w:bCs/>
+        </w:rPr>
+        <w:t>1. What exactly is the problem you are solving?</w:t>
+      </w:r>
+      <w:r>
+        <w:br/>
+        <w:t xml:space="preserve">We are developing an AI-powered system to automatically detect man-made marine debris and underwater anomalies from Side-Scan Sonar imagery and convert detections into geospatial information. </w:t>
+      </w:r>
+    </w:p>
+    <w:p>
+      <w:r>
+        <w:rPr>
+          <w:b/>
+          <w:bCs/>
+        </w:rPr>
+        <w:t>2. Why is Side-Scan Sonar (SSS) used instead of normal underwater cameras?</w:t>
+      </w:r>
+      <w:r>
+        <w:br/>
+        <w:t xml:space="preserve">SSS works in dark underwater environments and produces acoustic maps of the seabed, whereas cameras depend on light and water visibility. </w:t>
+      </w:r>
+    </w:p>
+    <w:p>
+      <w:r>
+        <w:rPr>
+          <w:b/>
+          <w:bCs/>
+        </w:rPr>
+        <w:t>3. How does Side-Scan Sonar work?</w:t>
+      </w:r>
+      <w:r>
+        <w:br/>
+        <w:t>SSS sends acoustic signals toward the seabed and uses the reflected signals to create an acoustic image of underwater objects and terrain.</w:t>
+      </w:r>
+    </w:p>
+    <w:p>
+      <w:r>
+        <w:rPr>
+          <w:b/>
+          <w:bCs/>
+        </w:rPr>
+        <w:t>4. What kind of objects can be detected using SSS?</w:t>
+      </w:r>
+      <w:r>
+        <w:br/>
+        <w:t xml:space="preserve">Our system targets ghost nets, shipwrecks, pipes, tyres, plastic waste and other man-made underwater anomalies. </w:t>
+      </w:r>
+    </w:p>
+    <w:p>
+      <w:r>
+        <w:rPr>
+          <w:b/>
+          <w:bCs/>
+        </w:rPr>
+        <w:t>5. What makes marine debris difficult to detect?</w:t>
+      </w:r>
+      <w:r>
+        <w:br/>
+        <w:t xml:space="preserve">Speckle noise, low contrast, acoustic shadows, natural seabed patterns and AUV motion distortion make automatic detection difficult. </w:t>
+      </w:r>
+    </w:p>
+    <w:p>
+      <w:r>
+        <w:rPr>
+          <w:b/>
+          <w:bCs/>
+        </w:rPr>
+        <w:t>6. How do you differentiate marine debris from natural seabed objects?</w:t>
+      </w:r>
+      <w:r>
+        <w:br/>
+        <w:t xml:space="preserve">We combine AI-based detection with acoustic-shadow verification to distinguish man-made targets from natural seabed features. </w:t>
+      </w:r>
+    </w:p>
+    <w:p>
+      <w:r>
+        <w:rPr>
+          <w:b/>
+          <w:bCs/>
+        </w:rPr>
+        <w:t>7. What is an acoustic shadow?</w:t>
+      </w:r>
+      <w:r>
+        <w:br/>
+        <w:t xml:space="preserve">An acoustic shadow is the dark region behind an object where the sonar signal is blocked or reduced by the object. </w:t>
+      </w:r>
+    </w:p>
+    <w:p>
+      <w:r>
+        <w:rPr>
+          <w:b/>
+          <w:bCs/>
+        </w:rPr>
+        <w:t>8. Why is an acoustic shadow useful for detection?</w:t>
+      </w:r>
+      <w:r>
+        <w:br/>
+        <w:t xml:space="preserve">A bright reflection followed by a corresponding dark shadow provides physical evidence that an elevated object exists on the seabed. </w:t>
+      </w:r>
+    </w:p>
+    <w:p>
+      <w:r>
+        <w:rPr>
+          <w:b/>
+          <w:bCs/>
+        </w:rPr>
+        <w:t>9. What are the major sources of noise in sonar images?</w:t>
+      </w:r>
+      <w:r>
+        <w:br/>
+        <w:t xml:space="preserve">Major issues include speckle noise, acoustic signal distortion, natural seabed patterns and AUV motion-related distortion. </w:t>
+      </w:r>
+    </w:p>
+    <w:p>
+      <w:r>
+        <w:rPr>
+          <w:b/>
+          <w:bCs/>
+        </w:rPr>
+        <w:t>10. What happens when debris and the seabed have similar acoustic signatures?</w:t>
+      </w:r>
+      <w:r>
+        <w:br/>
+        <w:t xml:space="preserve">The model may produce false positives, so we use sonar-specific preprocessing and acoustic-shadow verification to improve discrimination. </w:t>
+      </w:r>
+    </w:p>
+    <w:p>
+      <w:r>
+        <w:pict w14:anchorId="75755A2E">
+          <v:rect id="_x0000_i1096" style="width:0;height:1.5pt" o:hralign="center" o:hrstd="t" o:hr="t" fillcolor="#a0a0a0" stroked="f"/>
         </w:pict>
       </w:r>
     </w:p>
@@ -298,179 +166,112 @@
           <w:b/>
           <w:bCs/>
         </w:rPr>
-        <w:t>2. AI Detection &amp; Machine Learning (YOLO)</w:t>
-      </w:r>
-    </w:p>
-    <w:p>
-      <w:pPr>
-        <w:numPr>
-          <w:ilvl w:val="0"/>
-          <w:numId w:val="2"/>
-        </w:numPr>
-      </w:pPr>
-      <w:r>
-        <w:rPr>
-          <w:b/>
-          <w:bCs/>
-        </w:rPr>
-        <w:t>Q5: Which object detection architecture did you use and why?</w:t>
-      </w:r>
-    </w:p>
-    <w:p>
-      <w:pPr>
-        <w:numPr>
-          <w:ilvl w:val="1"/>
-          <w:numId w:val="2"/>
-        </w:numPr>
-      </w:pPr>
+        <w:t>AI Model Questions</w:t>
+      </w:r>
+    </w:p>
+    <w:p>
       <w:r>
         <w:rPr>
           <w:b/>
           <w:bCs/>
         </w:rPr>
         <w:lastRenderedPageBreak/>
-        <w:t>A:</w:t>
-      </w:r>
-      <w:r>
-        <w:t> We used YOLO (You Only Look Once) because it delivers real-time detection speed with high precision on sonar imagery.</w:t>
-      </w:r>
-    </w:p>
-    <w:p>
-      <w:pPr>
-        <w:numPr>
-          <w:ilvl w:val="0"/>
-          <w:numId w:val="2"/>
-        </w:numPr>
-      </w:pPr>
-      <w:r>
-        <w:rPr>
-          <w:b/>
-          <w:bCs/>
-        </w:rPr>
-        <w:t>Q6: What classes of marine debris does your model detect?</w:t>
-      </w:r>
-    </w:p>
-    <w:p>
-      <w:pPr>
-        <w:numPr>
-          <w:ilvl w:val="1"/>
-          <w:numId w:val="2"/>
-        </w:numPr>
-      </w:pPr>
-      <w:r>
-        <w:rPr>
-          <w:b/>
-          <w:bCs/>
-        </w:rPr>
-        <w:t>A:</w:t>
-      </w:r>
-      <w:r>
-        <w:t> Ghost fishing nets, shipwrecks, plane wrecks, macro-plastic patches, submerged cargo containers, and human artifacts.</w:t>
-      </w:r>
-    </w:p>
-    <w:p>
-      <w:pPr>
-        <w:numPr>
-          <w:ilvl w:val="0"/>
-          <w:numId w:val="2"/>
-        </w:numPr>
-      </w:pPr>
-      <w:r>
-        <w:rPr>
-          <w:b/>
-          <w:bCs/>
-        </w:rPr>
-        <w:t>Q7: How do you handle low-contrast sonar image quality before AI inference?</w:t>
-      </w:r>
-    </w:p>
-    <w:p>
-      <w:pPr>
-        <w:numPr>
-          <w:ilvl w:val="1"/>
-          <w:numId w:val="2"/>
-        </w:numPr>
-      </w:pPr>
-      <w:r>
-        <w:rPr>
-          <w:b/>
-          <w:bCs/>
-        </w:rPr>
-        <w:t>A:</w:t>
-      </w:r>
-      <w:r>
-        <w:t> Input images pass through an ML-driven adaptive filter that classifies noise levels and enhances contrast before feeding into YOLO.</w:t>
-      </w:r>
-    </w:p>
-    <w:p>
-      <w:pPr>
-        <w:numPr>
-          <w:ilvl w:val="0"/>
-          <w:numId w:val="2"/>
-        </w:numPr>
-      </w:pPr>
-      <w:r>
-        <w:rPr>
-          <w:b/>
-          <w:bCs/>
-        </w:rPr>
-        <w:t>Q8: What performance metrics did you evaluate for your detection model?</w:t>
-      </w:r>
-    </w:p>
-    <w:p>
-      <w:pPr>
-        <w:numPr>
-          <w:ilvl w:val="1"/>
-          <w:numId w:val="2"/>
-        </w:numPr>
-      </w:pPr>
-      <w:r>
-        <w:rPr>
-          <w:b/>
-          <w:bCs/>
-        </w:rPr>
-        <w:t>A:</w:t>
-      </w:r>
-      <w:r>
-        <w:t> We evaluated Mean Average Precision (mAP@0.5), Precision, Recall, and per-class confidence scores.</w:t>
-      </w:r>
-    </w:p>
-    <w:p>
-      <w:pPr>
-        <w:numPr>
-          <w:ilvl w:val="0"/>
-          <w:numId w:val="2"/>
-        </w:numPr>
-      </w:pPr>
-      <w:r>
-        <w:rPr>
-          <w:b/>
-          <w:bCs/>
-        </w:rPr>
-        <w:t>Q9: How does the system handle false positives in acoustic sonar clutter?</w:t>
-      </w:r>
-    </w:p>
-    <w:p>
-      <w:pPr>
-        <w:numPr>
-          <w:ilvl w:val="1"/>
-          <w:numId w:val="2"/>
-        </w:numPr>
-      </w:pPr>
-      <w:r>
-        <w:rPr>
-          <w:b/>
-          <w:bCs/>
-        </w:rPr>
-        <w:t>A:</w:t>
-      </w:r>
-      <w:r>
-        <w:t> A minimum confidence threshold combined with pre-inference adaptive noise filtering filters out random speckle noise and seafloor clutter.</w:t>
-      </w:r>
-    </w:p>
-    <w:p>
-      <w:r>
-        <w:pict w14:anchorId="68C106FD">
-          <v:rect id="_x0000_i1068" style="width:564pt;height:.75pt" o:hrpct="0" o:hralign="center" o:hrstd="t" o:hr="t" fillcolor="#a0a0a0" stroked="f"/>
+        <w:t>11. Which AI model are you using and why?</w:t>
+      </w:r>
+      <w:r>
+        <w:br/>
+        <w:t xml:space="preserve">We use </w:t>
+      </w:r>
+      <w:r>
+        <w:rPr>
+          <w:b/>
+          <w:bCs/>
+        </w:rPr>
+        <w:t>YOLOv8-OBB</w:t>
+      </w:r>
+      <w:r>
+        <w:t xml:space="preserve"> because it provides fast single-stage detection and handles arbitrarily oriented sonar targets using rotated bounding boxes. </w:t>
+      </w:r>
+    </w:p>
+    <w:p>
+      <w:r>
+        <w:rPr>
+          <w:b/>
+          <w:bCs/>
+        </w:rPr>
+        <w:t>12. Why did you choose YOLO instead of Faster R-CNN or U-Net?</w:t>
+      </w:r>
+      <w:r>
+        <w:br/>
+        <w:t xml:space="preserve">YOLO provides faster real-time detection for edge deployment, while U-Net is mainly suited for pixel-level segmentation and Faster R-CNN is comparatively computationally heavier. </w:t>
+      </w:r>
+    </w:p>
+    <w:p>
+      <w:r>
+        <w:rPr>
+          <w:b/>
+          <w:bCs/>
+        </w:rPr>
+        <w:t xml:space="preserve">13. What are </w:t>
+      </w:r>
+      <w:proofErr w:type="spellStart"/>
+      <w:r>
+        <w:rPr>
+          <w:b/>
+          <w:bCs/>
+        </w:rPr>
+        <w:t>IoU</w:t>
+      </w:r>
+      <w:proofErr w:type="spellEnd"/>
+      <w:r>
+        <w:rPr>
+          <w:b/>
+          <w:bCs/>
+        </w:rPr>
+        <w:t>, precision, recall and F1-score?</w:t>
+      </w:r>
+      <w:r>
+        <w:br/>
+      </w:r>
+      <w:proofErr w:type="spellStart"/>
+      <w:r>
+        <w:t>IoU</w:t>
+      </w:r>
+      <w:proofErr w:type="spellEnd"/>
+      <w:r>
+        <w:t xml:space="preserve"> measures box overlap, precision measures correct predictions, recall measures detected actual targets, and F1-score balances precision and recall.</w:t>
+      </w:r>
+    </w:p>
+    <w:p>
+      <w:r>
+        <w:rPr>
+          <w:b/>
+          <w:bCs/>
+        </w:rPr>
+        <w:t>14. Why not use a transformer-based model?</w:t>
+      </w:r>
+      <w:r>
+        <w:br/>
+        <w:t>Our priority is lightweight, low-latency edge inference, so YOLOv8-OBB is more suitable for the intended AUV deployment.</w:t>
+      </w:r>
+    </w:p>
+    <w:p>
+      <w:r>
+        <w:rPr>
+          <w:b/>
+          <w:bCs/>
+        </w:rPr>
+        <w:t>15. How will you improve the model's accuracy?</w:t>
+      </w:r>
+      <w:r>
+        <w:br/>
+        <w:t xml:space="preserve">We can improve accuracy using more representative sonar datasets, better preprocessing, augmentation, hyperparameter tuning and acoustic-shadow verification. </w:t>
+      </w:r>
+    </w:p>
+    <w:p>
+      <w:r>
+        <w:pict w14:anchorId="3211A035">
+          <v:rect id="_x0000_i1097" style="width:0;height:1.5pt" o:hralign="center" o:hrstd="t" o:hr="t" fillcolor="#a0a0a0" stroked="f"/>
         </w:pict>
       </w:r>
     </w:p>
@@ -486,112 +287,96 @@
           <w:b/>
           <w:bCs/>
         </w:rPr>
-        <w:t>3. Image Preprocessing &amp; Adaptive Noise Filtering</w:t>
-      </w:r>
-    </w:p>
-    <w:p>
-      <w:pPr>
-        <w:numPr>
-          <w:ilvl w:val="0"/>
-          <w:numId w:val="3"/>
-        </w:numPr>
-      </w:pPr>
-      <w:r>
-        <w:rPr>
-          <w:b/>
-          <w:bCs/>
-        </w:rPr>
-        <w:t>Q10: What feature extraction methods are used in your noise classifier?</w:t>
-      </w:r>
-    </w:p>
-    <w:p>
-      <w:pPr>
-        <w:numPr>
-          <w:ilvl w:val="1"/>
-          <w:numId w:val="3"/>
-        </w:numPr>
-      </w:pPr>
-      <w:r>
-        <w:rPr>
-          <w:b/>
-          <w:bCs/>
-        </w:rPr>
-        <w:t>A:</w:t>
-      </w:r>
-      <w:r>
-        <w:t> We extract 6 statistical features: mean intensity, standard deviation, variance, zero-pixel ratio, local variance, and Laplacian sharpness.</w:t>
-      </w:r>
-    </w:p>
-    <w:p>
-      <w:pPr>
-        <w:numPr>
-          <w:ilvl w:val="0"/>
-          <w:numId w:val="3"/>
-        </w:numPr>
-      </w:pPr>
-      <w:r>
-        <w:rPr>
-          <w:b/>
-          <w:bCs/>
-        </w:rPr>
-        <w:t>Q11: Why is adaptive filtering better than applying a static Gaussian or Median filter?</w:t>
-      </w:r>
-    </w:p>
-    <w:p>
-      <w:pPr>
-        <w:numPr>
-          <w:ilvl w:val="1"/>
-          <w:numId w:val="3"/>
-        </w:numPr>
-      </w:pPr>
-      <w:r>
-        <w:rPr>
-          <w:b/>
-          <w:bCs/>
-        </w:rPr>
-        <w:t>A:</w:t>
-      </w:r>
-      <w:r>
-        <w:t> Adaptive filtering dynamically adjusts filter strength based on local noise characteristics, preserving sharp object edges while removing speckle noise.</w:t>
-      </w:r>
-    </w:p>
-    <w:p>
-      <w:pPr>
-        <w:numPr>
-          <w:ilvl w:val="0"/>
-          <w:numId w:val="3"/>
-        </w:numPr>
-      </w:pPr>
-      <w:r>
-        <w:rPr>
-          <w:b/>
-          <w:bCs/>
-        </w:rPr>
-        <w:t>Q12: How is the noise classifier model integrated into the backend pipeline?</w:t>
-      </w:r>
-    </w:p>
-    <w:p>
-      <w:pPr>
-        <w:numPr>
-          <w:ilvl w:val="1"/>
-          <w:numId w:val="3"/>
-        </w:numPr>
-      </w:pPr>
-      <w:r>
-        <w:rPr>
-          <w:b/>
-          <w:bCs/>
-        </w:rPr>
-        <w:t>A:</w:t>
-      </w:r>
-      <w:r>
-        <w:t> It is serialized using joblib and loaded in FastAPI to instantly assess image features before applying OpenCV image transformation filters.</w:t>
-      </w:r>
-    </w:p>
-    <w:p>
-      <w:r>
-        <w:pict w14:anchorId="503602D5">
-          <v:rect id="_x0000_i1069" style="width:564pt;height:.75pt" o:hrpct="0" o:hralign="center" o:hrstd="t" o:hr="t" fillcolor="#a0a0a0" stroked="f"/>
+        <w:t>Sonar Image Processing</w:t>
+      </w:r>
+    </w:p>
+    <w:p>
+      <w:r>
+        <w:rPr>
+          <w:b/>
+          <w:bCs/>
+        </w:rPr>
+        <w:t>16. What preprocessing are you applying to sonar images?</w:t>
+      </w:r>
+      <w:r>
+        <w:br/>
+        <w:t xml:space="preserve">We apply </w:t>
+      </w:r>
+      <w:r>
+        <w:rPr>
+          <w:b/>
+          <w:bCs/>
+        </w:rPr>
+        <w:t>Lee/Frost denoising, CLAHE, normalization and slant-range correction</w:t>
+      </w:r>
+      <w:r>
+        <w:t xml:space="preserve"> before AI inference. </w:t>
+      </w:r>
+    </w:p>
+    <w:p>
+      <w:r>
+        <w:rPr>
+          <w:b/>
+          <w:bCs/>
+        </w:rPr>
+        <w:t>17. Why do you need preprocessing?</w:t>
+      </w:r>
+      <w:r>
+        <w:br/>
+        <w:t xml:space="preserve">Preprocessing reduces sonar noise and improves contrast and image quality so the detection model can extract target features more effectively. </w:t>
+      </w:r>
+    </w:p>
+    <w:p>
+      <w:r>
+        <w:rPr>
+          <w:b/>
+          <w:bCs/>
+        </w:rPr>
+        <w:t>18. What is a Lee filter?</w:t>
+      </w:r>
+      <w:r>
+        <w:br/>
+        <w:t xml:space="preserve">A Lee filter is an adaptive </w:t>
+      </w:r>
+      <w:proofErr w:type="spellStart"/>
+      <w:r>
+        <w:t>despeckling</w:t>
+      </w:r>
+      <w:proofErr w:type="spellEnd"/>
+      <w:r>
+        <w:t xml:space="preserve"> filter used to reduce acoustic speckle noise while preserving important image structures.</w:t>
+      </w:r>
+    </w:p>
+    <w:p>
+      <w:r>
+        <w:rPr>
+          <w:b/>
+          <w:bCs/>
+        </w:rPr>
+        <w:t>19. Why would you use a median/Gaussian filter?</w:t>
+      </w:r>
+      <w:r>
+        <w:br/>
+        <w:t xml:space="preserve">They can smooth unwanted noise and improve image quality, although our documented pipeline specifically proposes Lee/Frost filtering. </w:t>
+      </w:r>
+    </w:p>
+    <w:p>
+      <w:r>
+        <w:rPr>
+          <w:b/>
+          <w:bCs/>
+        </w:rPr>
+        <w:t>20. How does sonar speckle noise affect detection?</w:t>
+      </w:r>
+      <w:r>
+        <w:br/>
+        <w:t xml:space="preserve">Speckle noise creates grainy and distorted patterns that can hide target features and increase false detections. </w:t>
+      </w:r>
+    </w:p>
+    <w:p>
+      <w:r>
+        <w:pict w14:anchorId="693BD0B7">
+          <v:rect id="_x0000_i1098" style="width:0;height:1.5pt" o:hralign="center" o:hrstd="t" o:hr="t" fillcolor="#a0a0a0" stroked="f"/>
         </w:pict>
       </w:r>
     </w:p>
@@ -607,113 +392,146 @@
           <w:b/>
           <w:bCs/>
         </w:rPr>
-        <w:t>4. Geolocation &amp; Geodesic Positioning</w:t>
-      </w:r>
-    </w:p>
-    <w:p>
-      <w:pPr>
-        <w:numPr>
-          <w:ilvl w:val="0"/>
-          <w:numId w:val="4"/>
-        </w:numPr>
-      </w:pPr>
-      <w:r>
-        <w:rPr>
-          <w:b/>
-          <w:bCs/>
-        </w:rPr>
-        <w:t>Q13: How do you convert sonar target range and angle into actual GPS coordinates?</w:t>
-      </w:r>
-    </w:p>
-    <w:p>
-      <w:pPr>
-        <w:numPr>
-          <w:ilvl w:val="1"/>
-          <w:numId w:val="4"/>
-        </w:numPr>
-      </w:pPr>
+        <w:t>Datasets</w:t>
+      </w:r>
+    </w:p>
+    <w:p>
       <w:r>
         <w:rPr>
           <w:b/>
           <w:bCs/>
         </w:rPr>
         <w:lastRenderedPageBreak/>
-        <w:t>A:</w:t>
-      </w:r>
-      <w:r>
-        <w:t> We apply Vincenty's Direct Geodesic Formula on the WGS-84 ellipsoid using vessel latitude, longitude, heading, and sonar target range/azimuth.</w:t>
-      </w:r>
-    </w:p>
-    <w:p>
-      <w:pPr>
-        <w:numPr>
-          <w:ilvl w:val="0"/>
-          <w:numId w:val="4"/>
-        </w:numPr>
-      </w:pPr>
-      <w:r>
-        <w:rPr>
-          <w:b/>
-          <w:bCs/>
-        </w:rPr>
-        <w:t>Q14: Why use Vincenty’s formula instead of simpler Haversine or Euclidean math for target positioning?</w:t>
-      </w:r>
-    </w:p>
-    <w:p>
-      <w:pPr>
-        <w:numPr>
-          <w:ilvl w:val="1"/>
-          <w:numId w:val="4"/>
-        </w:numPr>
-      </w:pPr>
-      <w:r>
-        <w:rPr>
-          <w:b/>
-          <w:bCs/>
-        </w:rPr>
-        <w:t>A:</w:t>
-      </w:r>
-      <w:r>
-        <w:t> Vincenty accounts for the Earth’s ellipsoidal curvature (WGS-84), providing millimeter-accurate geographic coordinates over oceanic distances.</w:t>
-      </w:r>
-    </w:p>
-    <w:p>
-      <w:pPr>
-        <w:numPr>
-          <w:ilvl w:val="0"/>
-          <w:numId w:val="4"/>
-        </w:numPr>
-      </w:pPr>
-      <w:r>
-        <w:rPr>
-          <w:b/>
-          <w:bCs/>
-        </w:rPr>
-        <w:t>Q15: What input parameters are required from the vessel to compute target lat/lon?</w:t>
-      </w:r>
-    </w:p>
-    <w:p>
-      <w:pPr>
-        <w:numPr>
-          <w:ilvl w:val="1"/>
-          <w:numId w:val="4"/>
-        </w:numPr>
-      </w:pPr>
-      <w:r>
-        <w:rPr>
-          <w:b/>
-          <w:bCs/>
-        </w:rPr>
-        <w:t>A:</w:t>
-      </w:r>
-      <w:r>
-        <w:t> Vessel GPS latitude, vessel GPS longitude, vessel compass heading angle, target sonar range (meters), and target azimuth angle (degrees).</w:t>
-      </w:r>
-    </w:p>
-    <w:p>
-      <w:r>
-        <w:pict w14:anchorId="431786F0">
-          <v:rect id="_x0000_i1070" style="width:564pt;height:.75pt" o:hrpct="0" o:hralign="center" o:hrstd="t" o:hr="t" fillcolor="#a0a0a0" stroked="f"/>
+        <w:t>21. Which dataset are you using?</w:t>
+      </w:r>
+      <w:r>
+        <w:br/>
+        <w:t xml:space="preserve">Our primary benchmark is the </w:t>
+      </w:r>
+      <w:r>
+        <w:rPr>
+          <w:b/>
+          <w:bCs/>
+        </w:rPr>
+        <w:t>UATD (Underwater Acoustic Target Detection) Dataset</w:t>
+      </w:r>
+      <w:r>
+        <w:t xml:space="preserve">, containing approximately 9,200 acoustic frames. </w:t>
+      </w:r>
+    </w:p>
+    <w:p>
+      <w:r>
+        <w:rPr>
+          <w:b/>
+          <w:bCs/>
+        </w:rPr>
+        <w:t>22. What is UATD?</w:t>
+      </w:r>
+      <w:r>
+        <w:br/>
+        <w:t xml:space="preserve">UATD stands for </w:t>
+      </w:r>
+      <w:r>
+        <w:rPr>
+          <w:b/>
+          <w:bCs/>
+        </w:rPr>
+        <w:t>Underwater Acoustic Target Detection Dataset</w:t>
+      </w:r>
+      <w:r>
+        <w:t xml:space="preserve">, used as our primary benchmark for underwater acoustic target detection. </w:t>
+      </w:r>
+    </w:p>
+    <w:p>
+      <w:r>
+        <w:rPr>
+          <w:b/>
+          <w:bCs/>
+        </w:rPr>
+        <w:t>23. What is SCTD?</w:t>
+      </w:r>
+      <w:r>
+        <w:br/>
+        <w:t>The provided project documentation does not specify the full form or details of SCTD, so we should not claim an expansion without verifying the exact dataset.</w:t>
+      </w:r>
+    </w:p>
+    <w:p>
+      <w:r>
+        <w:rPr>
+          <w:b/>
+          <w:bCs/>
+        </w:rPr>
+        <w:t>24. What is the SSS Crab Pot Detection dataset?</w:t>
+      </w:r>
+      <w:r>
+        <w:br/>
+        <w:t>It is a Side-Scan Sonar dataset focused on detecting crab pots and provides additional sonar data relevant to man-made underwater-object detection.</w:t>
+      </w:r>
+    </w:p>
+    <w:p>
+      <w:r>
+        <w:rPr>
+          <w:b/>
+          <w:bCs/>
+        </w:rPr>
+        <w:t>25. What classes are present?</w:t>
+      </w:r>
+      <w:r>
+        <w:br/>
+        <w:t xml:space="preserve">Our current class mapping contains </w:t>
+      </w:r>
+      <w:r>
+        <w:rPr>
+          <w:b/>
+          <w:bCs/>
+        </w:rPr>
+        <w:t>ball, cube, human body, tyre, plane, ROV, square cage, circle cage, cylinder and metal bucket</w:t>
+      </w:r>
+      <w:r>
+        <w:t>.</w:t>
+      </w:r>
+    </w:p>
+    <w:p>
+      <w:r>
+        <w:rPr>
+          <w:b/>
+          <w:bCs/>
+        </w:rPr>
+        <w:t xml:space="preserve">26. What are range, azimuth, elevation, </w:t>
+      </w:r>
+      <w:proofErr w:type="spellStart"/>
+      <w:r>
+        <w:rPr>
+          <w:b/>
+          <w:bCs/>
+        </w:rPr>
+        <w:t>soundspeed</w:t>
+      </w:r>
+      <w:proofErr w:type="spellEnd"/>
+      <w:r>
+        <w:rPr>
+          <w:b/>
+          <w:bCs/>
+        </w:rPr>
+        <w:t xml:space="preserve"> and frequency?</w:t>
+      </w:r>
+      <w:r>
+        <w:br/>
+        <w:t xml:space="preserve">Range is target distance, azimuth is horizontal direction, elevation is vertical angle, </w:t>
+      </w:r>
+      <w:proofErr w:type="spellStart"/>
+      <w:r>
+        <w:t>soundspeed</w:t>
+      </w:r>
+      <w:proofErr w:type="spellEnd"/>
+      <w:r>
+        <w:t xml:space="preserve"> is the speed of sound in water, and frequency is the acoustic signal's cycles per second.</w:t>
+      </w:r>
+    </w:p>
+    <w:p>
+      <w:r>
+        <w:pict w14:anchorId="36C2F6EA">
+          <v:rect id="_x0000_i1099" style="width:0;height:1.5pt" o:hralign="center" o:hrstd="t" o:hr="t" fillcolor="#a0a0a0" stroked="f"/>
         </w:pict>
       </w:r>
     </w:p>
@@ -729,145 +547,52 @@
           <w:b/>
           <w:bCs/>
         </w:rPr>
-        <w:t>5. Trajectory &amp; Route Optimization Algorithm</w:t>
-      </w:r>
-    </w:p>
-    <w:p>
-      <w:pPr>
-        <w:numPr>
-          <w:ilvl w:val="0"/>
-          <w:numId w:val="5"/>
-        </w:numPr>
-      </w:pPr>
-      <w:r>
-        <w:rPr>
-          <w:b/>
-          <w:bCs/>
-        </w:rPr>
-        <w:t>Q16: Which route optimization algorithm did you implement and why?</w:t>
-      </w:r>
-    </w:p>
-    <w:p>
-      <w:pPr>
-        <w:numPr>
-          <w:ilvl w:val="1"/>
-          <w:numId w:val="5"/>
-        </w:numPr>
-      </w:pPr>
-      <w:r>
-        <w:rPr>
-          <w:b/>
-          <w:bCs/>
-        </w:rPr>
-        <w:t>A:</w:t>
-      </w:r>
-      <w:r>
-        <w:t> We implemented a TSP solver combining Greedy Nearest-Neighbor for initial tour construction and 2-Opt Local Search for edge-crossing elimination.</w:t>
-      </w:r>
-    </w:p>
-    <w:p>
-      <w:pPr>
-        <w:numPr>
-          <w:ilvl w:val="0"/>
-          <w:numId w:val="5"/>
-        </w:numPr>
-      </w:pPr>
-      <w:r>
-        <w:rPr>
-          <w:b/>
-          <w:bCs/>
-        </w:rPr>
-        <w:t>Q17: How does your system account for vessel operational costs?</w:t>
-      </w:r>
-    </w:p>
-    <w:p>
-      <w:pPr>
-        <w:numPr>
-          <w:ilvl w:val="1"/>
-          <w:numId w:val="5"/>
-        </w:numPr>
-      </w:pPr>
-      <w:r>
-        <w:rPr>
-          <w:b/>
-          <w:bCs/>
-        </w:rPr>
-        <w:t>A:</w:t>
-      </w:r>
-      <w:r>
-        <w:t> It calculates total distance in nautical miles, estimated transit duration at specified speed (knots), and total estimated fuel burn in liters.</w:t>
-      </w:r>
-    </w:p>
-    <w:p>
-      <w:pPr>
-        <w:numPr>
-          <w:ilvl w:val="0"/>
-          <w:numId w:val="5"/>
-        </w:numPr>
-      </w:pPr>
-      <w:r>
-        <w:rPr>
-          <w:b/>
-          <w:bCs/>
-        </w:rPr>
-        <w:t>Q18: What happens when the user selects a custom starting source point?</w:t>
-      </w:r>
-    </w:p>
-    <w:p>
-      <w:pPr>
-        <w:numPr>
-          <w:ilvl w:val="1"/>
-          <w:numId w:val="5"/>
-        </w:numPr>
-      </w:pPr>
-      <w:r>
-        <w:rPr>
-          <w:b/>
-          <w:bCs/>
-        </w:rPr>
-        <w:t>A:</w:t>
-      </w:r>
-      <w:r>
-        <w:t> The solver sets the selected point as origin index 0, optimizes the sequence visiting all remaining debris points, and calculates the return leg.</w:t>
-      </w:r>
-    </w:p>
-    <w:p>
-      <w:pPr>
-        <w:numPr>
-          <w:ilvl w:val="0"/>
-          <w:numId w:val="5"/>
-        </w:numPr>
-      </w:pPr>
-      <w:r>
-        <w:rPr>
-          <w:b/>
-          <w:bCs/>
-        </w:rPr>
-        <w:t>Q19: How do you calculate distance between multi-point debris coordinates during optimization?</w:t>
-      </w:r>
-    </w:p>
-    <w:p>
-      <w:pPr>
-        <w:numPr>
-          <w:ilvl w:val="1"/>
-          <w:numId w:val="5"/>
-        </w:numPr>
-      </w:pPr>
-      <w:r>
-        <w:rPr>
-          <w:b/>
-          <w:bCs/>
-        </w:rPr>
-        <w:t>A:</w:t>
-      </w:r>
-      <w:r>
-        <w:t> We construct a pairwise distance matrix using the Haversine formula to compute great-circle geodesic distances between all waypoints.</w:t>
-      </w:r>
-    </w:p>
-    <w:p>
-      <w:r>
-        <w:pict w14:anchorId="78A06BB1">
-          <v:rect id="_x0000_i1071" style="width:564pt;height:.75pt" o:hrpct="0" o:hralign="center" o:hrstd="t" o:hr="t" fillcolor="#a0a0a0" stroked="f"/>
+        <w:t>GPS + Sonar Metadata</w:t>
+      </w:r>
+    </w:p>
+    <w:p>
+      <w:r>
+        <w:rPr>
+          <w:b/>
+          <w:bCs/>
+        </w:rPr>
+        <w:t>27. How will you determine the location of detected debris?</w:t>
+      </w:r>
+      <w:r>
+        <w:br/>
+        <w:t xml:space="preserve">We combine the detection's image position with sonar range/azimuth and vehicle survey-position/heading metadata through coordinate transformation to obtain latitude and longitude. </w:t>
+      </w:r>
+    </w:p>
+    <w:p>
+      <w:r>
+        <w:rPr>
+          <w:b/>
+          <w:bCs/>
+        </w:rPr>
+        <w:t>28. How is GPS obtained underwater?</w:t>
+      </w:r>
+      <w:r>
+        <w:br/>
+        <w:t>GPS itself does not work effectively underwater, so underwater positioning requires systems such as INS, DVL or acoustic positioning, with GPS fixes typically available when the vehicle reaches the surface.</w:t>
+      </w:r>
+    </w:p>
+    <w:p>
+      <w:r>
+        <w:rPr>
+          <w:b/>
+          <w:bCs/>
+        </w:rPr>
+        <w:t>29. How are sonar range and azimuth used?</w:t>
+      </w:r>
+      <w:r>
+        <w:br/>
+        <w:t xml:space="preserve">Range gives the target's distance and azimuth gives its direction, which are combined with the vehicle position and heading for geolocation. </w:t>
+      </w:r>
+    </w:p>
+    <w:p>
+      <w:r>
+        <w:pict w14:anchorId="70874134">
+          <v:rect id="_x0000_i1100" style="width:0;height:1.5pt" o:hralign="center" o:hrstd="t" o:hr="t" fillcolor="#a0a0a0" stroked="f"/>
         </w:pict>
       </w:r>
     </w:p>
@@ -883,146 +608,44 @@
           <w:b/>
           <w:bCs/>
         </w:rPr>
-        <w:t>6. Frontend &amp; 3D Visualization Stack</w:t>
-      </w:r>
-    </w:p>
-    <w:p>
-      <w:pPr>
-        <w:numPr>
-          <w:ilvl w:val="0"/>
-          <w:numId w:val="6"/>
-        </w:numPr>
-      </w:pPr>
-      <w:r>
-        <w:rPr>
-          <w:b/>
-          <w:bCs/>
-        </w:rPr>
-        <w:t>Q20: What frameworks are used for building the user interface?</w:t>
-      </w:r>
-    </w:p>
-    <w:p>
-      <w:pPr>
-        <w:numPr>
-          <w:ilvl w:val="1"/>
-          <w:numId w:val="6"/>
-        </w:numPr>
-      </w:pPr>
-      <w:r>
-        <w:rPr>
-          <w:b/>
-          <w:bCs/>
-        </w:rPr>
-        <w:t>A:</w:t>
-      </w:r>
-      <w:r>
-        <w:t> React 19 for modular component architecture and Leaflet with leaflet-polylinedecorator for interactive 2D mapping.</w:t>
-      </w:r>
-    </w:p>
-    <w:p>
-      <w:pPr>
-        <w:numPr>
-          <w:ilvl w:val="0"/>
-          <w:numId w:val="6"/>
-        </w:numPr>
-      </w:pPr>
-      <w:r>
-        <w:rPr>
-          <w:b/>
-          <w:bCs/>
-        </w:rPr>
-        <w:t>Q21: How is the 3D Map feature rendered in the browser?</w:t>
-      </w:r>
-    </w:p>
-    <w:p>
-      <w:pPr>
-        <w:numPr>
-          <w:ilvl w:val="1"/>
-          <w:numId w:val="6"/>
-        </w:numPr>
-      </w:pPr>
+        <w:t>Edge Computing</w:t>
+      </w:r>
+    </w:p>
+    <w:p>
       <w:r>
         <w:rPr>
           <w:b/>
           <w:bCs/>
         </w:rPr>
         <w:lastRenderedPageBreak/>
-        <w:t>A:</w:t>
-      </w:r>
-      <w:r>
-        <w:t> Using Three.js via @react-three/fiber and @react-three/drei to render interactive 3D GLB models of ships, ROVs, and detected debris targets.</w:t>
-      </w:r>
-    </w:p>
-    <w:p>
-      <w:pPr>
-        <w:numPr>
-          <w:ilvl w:val="0"/>
-          <w:numId w:val="6"/>
-        </w:numPr>
-      </w:pPr>
-      <w:r>
-        <w:rPr>
-          <w:b/>
-          <w:bCs/>
-        </w:rPr>
-        <w:t>Q22: How does the map visualize path travel directions for vessel navigation?</w:t>
-      </w:r>
-    </w:p>
-    <w:p>
-      <w:pPr>
-        <w:numPr>
-          <w:ilvl w:val="1"/>
-          <w:numId w:val="6"/>
-        </w:numPr>
-      </w:pPr>
-      <w:r>
-        <w:rPr>
-          <w:b/>
-          <w:bCs/>
-        </w:rPr>
-        <w:t>A:</w:t>
-      </w:r>
-      <w:r>
-        <w:t> Polyline directional arrow decorators rendered along polyline segments indicate exact direction from Step 1 origin to subsequent waypoints.</w:t>
-      </w:r>
-    </w:p>
-    <w:p>
-      <w:pPr>
-        <w:numPr>
-          <w:ilvl w:val="0"/>
-          <w:numId w:val="6"/>
-        </w:numPr>
-      </w:pPr>
-      <w:r>
-        <w:rPr>
-          <w:b/>
-          <w:bCs/>
-        </w:rPr>
-        <w:t>Q23: How do you prevent overlapping markers on the map when the vessel returns to origin?</w:t>
-      </w:r>
-    </w:p>
-    <w:p>
-      <w:pPr>
-        <w:numPr>
-          <w:ilvl w:val="1"/>
-          <w:numId w:val="6"/>
-        </w:numPr>
-      </w:pPr>
-      <w:r>
-        <w:rPr>
-          <w:b/>
-          <w:bCs/>
-        </w:rPr>
-        <w:t>A:</w:t>
-      </w:r>
-      <w:r>
-        <w:t> The map component skips duplicate marker icon placement on the return-to-origin leg while preserving the full closed path polyline.</w:t>
-      </w:r>
-    </w:p>
-    <w:p>
-      <w:r>
-        <w:pict w14:anchorId="3D506295">
-          <v:rect id="_x0000_i1072" style="width:564pt;height:.75pt" o:hrpct="0" o:hralign="center" o:hrstd="t" o:hr="t" fillcolor="#a0a0a0" stroked="f"/>
+        <w:t>30. What is ONNX?</w:t>
+      </w:r>
+      <w:r>
+        <w:br/>
+      </w:r>
+      <w:r>
+        <w:rPr>
+          <w:b/>
+          <w:bCs/>
+        </w:rPr>
+        <w:t>ONNX (Open Neural Network Exchange)</w:t>
+      </w:r>
+      <w:r>
+        <w:t xml:space="preserve"> is a model format that allows the trained YOLO model to be exported and optimized for deployment using runtimes such as ONNX Runtime or </w:t>
+      </w:r>
+      <w:proofErr w:type="spellStart"/>
+      <w:r>
+        <w:t>TensorRT</w:t>
+      </w:r>
+      <w:proofErr w:type="spellEnd"/>
+      <w:r>
+        <w:t xml:space="preserve">. </w:t>
+      </w:r>
+    </w:p>
+    <w:p>
+      <w:r>
+        <w:pict w14:anchorId="0FDD4BB3">
+          <v:rect id="_x0000_i1101" style="width:0;height:1.5pt" o:hralign="center" o:hrstd="t" o:hr="t" fillcolor="#a0a0a0" stroked="f"/>
         </w:pict>
       </w:r>
     </w:p>
@@ -1038,261 +661,62 @@
           <w:b/>
           <w:bCs/>
         </w:rPr>
-        <w:t>7. Backend Architecture &amp; API Design</w:t>
-      </w:r>
-    </w:p>
-    <w:p>
-      <w:pPr>
-        <w:numPr>
-          <w:ilvl w:val="0"/>
-          <w:numId w:val="7"/>
-        </w:numPr>
-      </w:pPr>
-      <w:r>
-        <w:rPr>
-          <w:b/>
-          <w:bCs/>
-        </w:rPr>
-        <w:t>Q24: What is the backend framework and why was it chosen?</w:t>
-      </w:r>
-    </w:p>
-    <w:p>
-      <w:pPr>
-        <w:numPr>
-          <w:ilvl w:val="1"/>
-          <w:numId w:val="7"/>
-        </w:numPr>
-      </w:pPr>
-      <w:r>
-        <w:rPr>
-          <w:b/>
-          <w:bCs/>
-        </w:rPr>
-        <w:t>A:</w:t>
-      </w:r>
-      <w:r>
-        <w:t> FastAPI in Python, chosen for high-performance asynchronous API execution, lightweight routing, and native PyTorch/OpenCV support.</w:t>
-      </w:r>
-    </w:p>
-    <w:p>
-      <w:pPr>
-        <w:numPr>
-          <w:ilvl w:val="0"/>
-          <w:numId w:val="7"/>
-        </w:numPr>
-      </w:pPr>
-      <w:r>
-        <w:rPr>
-          <w:b/>
-          <w:bCs/>
-        </w:rPr>
-        <w:t>Q25: How are file uploads and custom CSV datasets handled by the system?</w:t>
-      </w:r>
-    </w:p>
-    <w:p>
-      <w:pPr>
-        <w:numPr>
-          <w:ilvl w:val="1"/>
-          <w:numId w:val="7"/>
-        </w:numPr>
-      </w:pPr>
-      <w:r>
-        <w:rPr>
-          <w:b/>
-          <w:bCs/>
-        </w:rPr>
-        <w:t>A:</w:t>
-      </w:r>
-      <w:r>
-        <w:t> FastAPI endpoints parse Multipart CSV uploads, extract coordinate headers (lat, lon, name), validate numerical fields, and return formatted JSON targets.</w:t>
-      </w:r>
-    </w:p>
-    <w:p>
-      <w:pPr>
-        <w:numPr>
-          <w:ilvl w:val="0"/>
-          <w:numId w:val="7"/>
-        </w:numPr>
-      </w:pPr>
-      <w:r>
-        <w:rPr>
-          <w:b/>
-          <w:bCs/>
-        </w:rPr>
-        <w:t>Q26: Is your API architecture RESTful and decoupled?</w:t>
-      </w:r>
-    </w:p>
-    <w:p>
-      <w:pPr>
-        <w:numPr>
-          <w:ilvl w:val="1"/>
-          <w:numId w:val="7"/>
-        </w:numPr>
-      </w:pPr>
-      <w:r>
-        <w:rPr>
-          <w:b/>
-          <w:bCs/>
-        </w:rPr>
-        <w:t>A:</w:t>
-      </w:r>
-      <w:r>
-        <w:t> Yes, backend FastAPI endpoints handle computation independently and interface with the React frontend via JSON REST responses.</w:t>
-      </w:r>
-    </w:p>
-    <w:p>
-      <w:r>
-        <w:pict w14:anchorId="4FE2BC94">
-          <v:rect id="_x0000_i1073" style="width:564pt;height:.75pt" o:hrpct="0" o:hralign="center" o:hrstd="t" o:hr="t" fillcolor="#a0a0a0" stroked="f"/>
-        </w:pict>
-      </w:r>
-    </w:p>
-    <w:p>
-      <w:pPr>
-        <w:rPr>
-          <w:b/>
-          <w:bCs/>
-        </w:rPr>
-      </w:pPr>
-      <w:r>
-        <w:rPr>
-          <w:b/>
-          <w:bCs/>
-        </w:rPr>
-        <w:t>8. Scalability, Future Scope &amp; Deployment</w:t>
-      </w:r>
-    </w:p>
-    <w:p>
-      <w:pPr>
-        <w:numPr>
-          <w:ilvl w:val="0"/>
-          <w:numId w:val="8"/>
-        </w:numPr>
-      </w:pPr>
-      <w:r>
-        <w:rPr>
-          <w:b/>
-          <w:bCs/>
-        </w:rPr>
-        <w:t>Q27: How can this project be deployed on live marine cleanup vessels?</w:t>
-      </w:r>
-    </w:p>
-    <w:p>
-      <w:pPr>
-        <w:numPr>
-          <w:ilvl w:val="1"/>
-          <w:numId w:val="8"/>
-        </w:numPr>
-      </w:pPr>
-      <w:r>
-        <w:rPr>
-          <w:b/>
-          <w:bCs/>
-        </w:rPr>
-        <w:t>A:</w:t>
-      </w:r>
-      <w:r>
-        <w:t> It can be containerized using Docker and deployed on vessel-edge hardware (e.g., NVIDIA Jetson) connected directly to onboard sonar feeds.</w:t>
-      </w:r>
-    </w:p>
-    <w:p>
-      <w:pPr>
-        <w:numPr>
-          <w:ilvl w:val="0"/>
-          <w:numId w:val="8"/>
-        </w:numPr>
-      </w:pPr>
-      <w:r>
-        <w:rPr>
-          <w:b/>
-          <w:bCs/>
-        </w:rPr>
-        <w:t>Q28: How scalable is your route optimization algorithm for hundreds of debris targets?</w:t>
-      </w:r>
-    </w:p>
-    <w:p>
-      <w:pPr>
-        <w:numPr>
-          <w:ilvl w:val="1"/>
-          <w:numId w:val="8"/>
-        </w:numPr>
-      </w:pPr>
-      <w:r>
-        <w:rPr>
-          <w:b/>
-          <w:bCs/>
-        </w:rPr>
-        <w:t>A:</w:t>
-      </w:r>
-      <w:r>
-        <w:t> 2-Opt local search computes in milliseconds for typical operational target clusters (&lt; 100 points) and can be upgraded to Lin-Kernighan for massive datasets.</w:t>
-      </w:r>
-    </w:p>
-    <w:p>
-      <w:pPr>
-        <w:numPr>
-          <w:ilvl w:val="0"/>
-          <w:numId w:val="8"/>
-        </w:numPr>
-      </w:pPr>
-      <w:r>
-        <w:rPr>
-          <w:b/>
-          <w:bCs/>
-        </w:rPr>
-        <w:t>Q29: How can real-time ocean current data be integrated in future iterations?</w:t>
-      </w:r>
-    </w:p>
-    <w:p>
-      <w:pPr>
-        <w:numPr>
-          <w:ilvl w:val="1"/>
-          <w:numId w:val="8"/>
-        </w:numPr>
-      </w:pPr>
-      <w:r>
-        <w:rPr>
-          <w:b/>
-          <w:bCs/>
-        </w:rPr>
-        <w:lastRenderedPageBreak/>
-        <w:t>A:</w:t>
-      </w:r>
-      <w:r>
-        <w:t> By adding ocean current drift vectors into the distance matrix weight calculation to dynamically adjust transit speed and fuel burn estimates.</w:t>
-      </w:r>
-    </w:p>
-    <w:p>
-      <w:pPr>
-        <w:numPr>
-          <w:ilvl w:val="0"/>
-          <w:numId w:val="8"/>
-        </w:numPr>
-      </w:pPr>
-      <w:r>
-        <w:rPr>
-          <w:b/>
-          <w:bCs/>
-        </w:rPr>
-        <w:t>Q30: What makes your solution stand out from existing marine inspection tools?</w:t>
-      </w:r>
-    </w:p>
-    <w:p>
-      <w:pPr>
-        <w:numPr>
-          <w:ilvl w:val="1"/>
-          <w:numId w:val="8"/>
-        </w:numPr>
-      </w:pPr>
-      <w:r>
-        <w:rPr>
-          <w:b/>
-          <w:bCs/>
-        </w:rPr>
-        <w:t>A:</w:t>
-      </w:r>
-      <w:r>
-        <w:t> It offers an end-to-end pipeline combining ML noise filtering, YOLO AI detection, WGS-84 geodesic math, TSP route optimization, and 3D web visualization in one unified system.</w:t>
+        <w:t>Training &amp; Testing</w:t>
+      </w:r>
+    </w:p>
+    <w:p>
+      <w:r>
+        <w:rPr>
+          <w:b/>
+          <w:bCs/>
+        </w:rPr>
+        <w:t>31. How are you evaluating your model?</w:t>
+      </w:r>
+      <w:r>
+        <w:br/>
+        <w:t xml:space="preserve">We evaluate using </w:t>
+      </w:r>
+      <w:r>
+        <w:rPr>
+          <w:b/>
+          <w:bCs/>
+        </w:rPr>
+        <w:t>Precision, Recall, mAP@50 and mAP@50–95</w:t>
+      </w:r>
+      <w:r>
+        <w:t xml:space="preserve">, with the documented final results of 97.30% precision, 96.74% recall, 96.97% peak mAP@50 and 58.78% peak mAP@50–95. </w:t>
+      </w:r>
+    </w:p>
+    <w:p>
+      <w:r>
+        <w:rPr>
+          <w:b/>
+          <w:bCs/>
+        </w:rPr>
+        <w:t>32. What is your train/validation/test split?</w:t>
+      </w:r>
+      <w:r>
+        <w:br/>
+        <w:t xml:space="preserve">The documentation identifies </w:t>
+      </w:r>
+      <w:proofErr w:type="spellStart"/>
+      <w:r>
+        <w:rPr>
+          <w:b/>
+          <w:bCs/>
+        </w:rPr>
+        <w:t>UATD_Training</w:t>
+      </w:r>
+      <w:proofErr w:type="spellEnd"/>
+      <w:r>
+        <w:rPr>
+          <w:b/>
+          <w:bCs/>
+        </w:rPr>
+        <w:t>, UATD_Test_1 and UATD_Test_2</w:t>
+      </w:r>
+      <w:r>
+        <w:t xml:space="preserve">, but the exact train/validation/test split is not yet documented and should be finalized before presenting it as a final evaluation protocol. </w:t>
       </w:r>
     </w:p>
     <w:p/>

</xml_diff>